<commit_message>
feat: sync 2026-09-15 TP running workout (12.05km, 80.4 rTSS) and update W38 dashboard, execution report & swim nav
</commit_message>
<xml_diff>
--- a/docs/weekly/2026-W38_當週執行率回顧報告.docx
+++ b/docs/weekly/2026-W38_當週執行率回顧報告.docx
@@ -21,7 +21,7 @@
           <w:color w:val="555555"/>
           <w:sz w:val="20"/>
         </w:rPr>
-        <w:t>週期：2026/09/14–2026/09/20　｜　整體時間執行率：0.0%</w:t>
+        <w:t>週期：2026/09/14–2026/09/20　｜　整體時間執行率：9.4%</w:t>
       </w:r>
     </w:p>
     <w:p>
@@ -783,7 +783,7 @@
                 <w:color w:val="000000"/>
                 <w:sz w:val="19"/>
               </w:rPr>
-              <w:t>0.00 hr</w:t>
+              <w:t>1.40 hr</w:t>
             </w:r>
           </w:p>
         </w:tc>
@@ -810,7 +810,7 @@
                 <w:color w:val="000000"/>
                 <w:sz w:val="19"/>
               </w:rPr>
-              <w:t>0.0%</w:t>
+              <w:t>31.1%</w:t>
             </w:r>
           </w:p>
         </w:tc>
@@ -864,7 +864,7 @@
                 <w:color w:val="000000"/>
                 <w:sz w:val="19"/>
               </w:rPr>
-              <w:t>0.00 km</w:t>
+              <w:t>12.05 km</w:t>
             </w:r>
           </w:p>
         </w:tc>
@@ -891,7 +891,7 @@
                 <w:color w:val="000000"/>
                 <w:sz w:val="19"/>
               </w:rPr>
-              <w:t>0.0%</w:t>
+              <w:t>37.0%</w:t>
             </w:r>
           </w:p>
         </w:tc>
@@ -1797,7 +1797,7 @@
                 <w:color w:val="000000"/>
                 <w:sz w:val="19"/>
               </w:rPr>
-              <w:t>0分</w:t>
+              <w:t>84分 / 12.05km</w:t>
             </w:r>
           </w:p>
         </w:tc>
@@ -1824,7 +1824,7 @@
                 <w:color w:val="000000"/>
                 <w:sz w:val="19"/>
               </w:rPr>
-              <w:t>❌ 未執行/待排程</w:t>
+              <w:t>🟢 良好達標 (93%, A-)</w:t>
             </w:r>
           </w:p>
         </w:tc>
@@ -3179,11 +3179,19 @@
     </w:p>
     <w:p>
       <w:r>
-        <w:t>• 當週累積自行車 0.00 km、跑步 0.00 km、游泳 0.00 km，整體時間執行率達 0.0%。</w:t>
+        <w:t>• 當週累積自行車 0.00 km、跑步 12.05 km、游泳 0.00 km，整體時間執行率達 9.4%。</w:t>
         <w:br/>
       </w:r>
       <w:r>
-        <w:t>• 在高負荷訓練後無縫銜接轉換跑，並依據即時心率與體感自覺彈性調整，兼顧神經肌肉適應與傷害防範。</w:t>
+        <w:t>• Build 1-3 第一建構期巔峰週展開 (Peak Build Phase)：本週為第一建構期負荷最高峰，全週排定總訓練時長達 14.9 小時。截至目前已累積跑步 12.05 km (1.41 小時)，整體時間執行率達 9.4%。</w:t>
+        <w:br/>
+      </w:r>
+      <w:r>
+        <w:t>• 週二 12.05km 跑步專項高水準間歇 (80.4 rTSS)：9/15 早晨順利完成 1 小時 24 分 33 秒 12.05 km 跑步專項課表 (原定 11.60km，距離達成率 103.9% 超額完成，TSS 達成率 97.6%)。均速 7:01/km (均速 8.55 km/h，最快 4:00/km)，均瓦 212W (3.20 W/kg，最大 400W，做功 1,077.9 kJ)，均心率 155 bpm (最高 191 bpm 深度刺激心肌收縮與攝氧能力)。多組 400m 間歇衝刺組均速飆出 3:45~3:55/km，衝刺步頻高達 180~188 spm (最高 214 spm)！平均觸地時間僅 249ms、垂直比 8.0% (&lt;9% 頂級標準)，展現極致跑姿落地剛性與動態經濟性，體感自覺給出 5/5 極佳滿分！</w:t>
+        <w:br/>
+      </w:r>
+      <w:r>
+        <w:t>• 明日週三 50m 長池甜甜泳課動態排酸：明日排定 80 分鐘 50m 長池「甜甜課表」，善用長池水壓與浮力深度代謝今日下肢跑步乳酸，持續鞏固 Sub-11 (1:53/100m) 流線型水感，可查閱儀表板 #swim 專區最新游泳技術文章。</w:t>
         <w:br/>
       </w:r>
     </w:p>

</xml_diff>

<commit_message>
Auto Daily 8:00 PM Dashboard Update [2026-09-15 20:00]
</commit_message>
<xml_diff>
--- a/docs/weekly/2026-W38_當週執行率回顧報告.docx
+++ b/docs/weekly/2026-W38_當週執行率回顧報告.docx
@@ -21,7 +21,7 @@
           <w:color w:val="555555"/>
           <w:sz w:val="20"/>
         </w:rPr>
-        <w:t>週期：2026/09/14–2026/09/20　｜　整體時間執行率：9.4%</w:t>
+        <w:t>週期：2026/09/14–2026/09/20　｜　整體時間執行率：13.8%</w:t>
       </w:r>
     </w:p>
     <w:p>
@@ -565,7 +565,7 @@
                 <w:color w:val="000000"/>
                 <w:sz w:val="19"/>
               </w:rPr>
-              <w:t>0.00 hr</w:t>
+              <w:t>0.67 hr</w:t>
             </w:r>
           </w:p>
         </w:tc>
@@ -592,7 +592,7 @@
                 <w:color w:val="000000"/>
                 <w:sz w:val="19"/>
               </w:rPr>
-              <w:t>0.0%</w:t>
+              <w:t>10.1%</w:t>
             </w:r>
           </w:p>
         </w:tc>
@@ -646,7 +646,7 @@
                 <w:color w:val="000000"/>
                 <w:sz w:val="19"/>
               </w:rPr>
-              <w:t>0.00 km</w:t>
+              <w:t>18.76 km</w:t>
             </w:r>
           </w:p>
         </w:tc>
@@ -673,7 +673,7 @@
                 <w:color w:val="000000"/>
                 <w:sz w:val="19"/>
               </w:rPr>
-              <w:t>0.0%</w:t>
+              <w:t>15.6%</w:t>
             </w:r>
           </w:p>
         </w:tc>
@@ -1631,7 +1631,7 @@
                 <w:color w:val="000000"/>
                 <w:sz w:val="19"/>
               </w:rPr>
-              <w:t>0分</w:t>
+              <w:t>40分 / 18.76km</w:t>
             </w:r>
           </w:p>
         </w:tc>
@@ -1658,7 +1658,7 @@
                 <w:color w:val="000000"/>
                 <w:sz w:val="19"/>
               </w:rPr>
-              <w:t>❌ 未執行/待排程</w:t>
+              <w:t>✅ 精準達標 (100%, A+)</w:t>
             </w:r>
           </w:p>
         </w:tc>
@@ -3179,11 +3179,11 @@
     </w:p>
     <w:p>
       <w:r>
-        <w:t>• 當週累積自行車 0.00 km、跑步 12.05 km、游泳 0.00 km，整體時間執行率達 9.4%。</w:t>
+        <w:t>• 當週累積自行車 18.76 km、跑步 12.05 km、游泳 0.00 km，整體時間執行率達 13.8%。</w:t>
         <w:br/>
       </w:r>
       <w:r>
-        <w:t>• Build 1-3 第一建構期巔峰週展開 (Peak Build Phase)：本週為第一建構期負荷最高峰，全週排定總訓練時長達 14.9 小時。截至目前已累積跑步 12.05 km (1.41 小時)，整體時間執行率達 9.4%。</w:t>
+        <w:t>• Build 1-3 第一建構期巔峰週展開 (Peak Build Phase)：本週為第一建構期負荷最高峰，全週排定總訓練時長達 14.9 小時。截至目前已累積跑步 12.05 km (1.41 小時)，整體時間執行率達 13.8%。</w:t>
         <w:br/>
       </w:r>
       <w:r>

</xml_diff>

<commit_message>
Auto Daily 8:00 PM Dashboard Update [2026-09-17 20:06]
</commit_message>
<xml_diff>
--- a/docs/weekly/2026-W38_當週執行率回顧報告.docx
+++ b/docs/weekly/2026-W38_當週執行率回顧報告.docx
@@ -21,7 +21,7 @@
           <w:color w:val="555555"/>
           <w:sz w:val="20"/>
         </w:rPr>
-        <w:t>週期：2026/09/14–2026/09/20　｜　整體時間執行率：13.8%</w:t>
+        <w:t>週期：2026/09/14–2026/09/20　｜　整體時間執行率：33.9%</w:t>
       </w:r>
     </w:p>
     <w:p>
@@ -347,7 +347,7 @@
                 <w:color w:val="000000"/>
                 <w:sz w:val="19"/>
               </w:rPr>
-              <w:t>0.00 hr</w:t>
+              <w:t>1.07 hr</w:t>
             </w:r>
           </w:p>
         </w:tc>
@@ -374,7 +374,7 @@
                 <w:color w:val="000000"/>
                 <w:sz w:val="19"/>
               </w:rPr>
-              <w:t>0.0%</w:t>
+              <w:t>27.8%</w:t>
             </w:r>
           </w:p>
         </w:tc>
@@ -428,7 +428,7 @@
                 <w:color w:val="000000"/>
                 <w:sz w:val="19"/>
               </w:rPr>
-              <w:t>0.00 km</w:t>
+              <w:t>3.35 km</w:t>
             </w:r>
           </w:p>
         </w:tc>
@@ -455,7 +455,7 @@
                 <w:color w:val="000000"/>
                 <w:sz w:val="19"/>
               </w:rPr>
-              <w:t>0.0%</w:t>
+              <w:t>95.7%</w:t>
             </w:r>
           </w:p>
         </w:tc>
@@ -565,7 +565,7 @@
                 <w:color w:val="000000"/>
                 <w:sz w:val="19"/>
               </w:rPr>
-              <w:t>0.67 hr</w:t>
+              <w:t>2.10 hr</w:t>
             </w:r>
           </w:p>
         </w:tc>
@@ -592,7 +592,7 @@
                 <w:color w:val="000000"/>
                 <w:sz w:val="19"/>
               </w:rPr>
-              <w:t>10.1%</w:t>
+              <w:t>31.8%</w:t>
             </w:r>
           </w:p>
         </w:tc>
@@ -646,7 +646,7 @@
                 <w:color w:val="000000"/>
                 <w:sz w:val="19"/>
               </w:rPr>
-              <w:t>18.76 km</w:t>
+              <w:t>57.08 km</w:t>
             </w:r>
           </w:p>
         </w:tc>
@@ -673,7 +673,7 @@
                 <w:color w:val="000000"/>
                 <w:sz w:val="19"/>
               </w:rPr>
-              <w:t>15.6%</w:t>
+              <w:t>47.6%</w:t>
             </w:r>
           </w:p>
         </w:tc>
@@ -783,7 +783,7 @@
                 <w:color w:val="000000"/>
                 <w:sz w:val="19"/>
               </w:rPr>
-              <w:t>1.40 hr</w:t>
+              <w:t>1.90 hr</w:t>
             </w:r>
           </w:p>
         </w:tc>
@@ -810,7 +810,7 @@
                 <w:color w:val="000000"/>
                 <w:sz w:val="19"/>
               </w:rPr>
-              <w:t>31.1%</w:t>
+              <w:t>42.2%</w:t>
             </w:r>
           </w:p>
         </w:tc>
@@ -864,7 +864,7 @@
                 <w:color w:val="000000"/>
                 <w:sz w:val="19"/>
               </w:rPr>
-              <w:t>12.05 km</w:t>
+              <w:t>17.08 km</w:t>
             </w:r>
           </w:p>
         </w:tc>
@@ -891,7 +891,7 @@
                 <w:color w:val="000000"/>
                 <w:sz w:val="19"/>
               </w:rPr>
-              <w:t>37.0%</w:t>
+              <w:t>52.4%</w:t>
             </w:r>
           </w:p>
         </w:tc>
@@ -1963,7 +1963,7 @@
                 <w:color w:val="000000"/>
                 <w:sz w:val="19"/>
               </w:rPr>
-              <w:t>0分</w:t>
+              <w:t>64分 / 3.35km</w:t>
             </w:r>
           </w:p>
         </w:tc>
@@ -1990,7 +1990,7 @@
                 <w:color w:val="000000"/>
                 <w:sz w:val="19"/>
               </w:rPr>
-              <w:t>❌ 未執行/待排程</w:t>
+              <w:t>🟢 良好達標 (80%, A-)</w:t>
             </w:r>
           </w:p>
         </w:tc>
@@ -2129,7 +2129,7 @@
                 <w:color w:val="000000"/>
                 <w:sz w:val="19"/>
               </w:rPr>
-              <w:t>0分</w:t>
+              <w:t>86分 / 38.32km</w:t>
             </w:r>
           </w:p>
         </w:tc>
@@ -2156,7 +2156,7 @@
                 <w:color w:val="000000"/>
                 <w:sz w:val="19"/>
               </w:rPr>
-              <w:t>❌ 未執行/待排程</w:t>
+              <w:t>✅ 精準達標 (100%, A+)</w:t>
             </w:r>
           </w:p>
         </w:tc>
@@ -2295,7 +2295,7 @@
                 <w:color w:val="000000"/>
                 <w:sz w:val="19"/>
               </w:rPr>
-              <w:t>0分</w:t>
+              <w:t>30分 / 5.03km</w:t>
             </w:r>
           </w:p>
         </w:tc>
@@ -2322,7 +2322,7 @@
                 <w:color w:val="000000"/>
                 <w:sz w:val="19"/>
               </w:rPr>
-              <w:t>❌ 未執行/待排程</w:t>
+              <w:t>✅ 精準達標 (100%, A+)</w:t>
             </w:r>
           </w:p>
         </w:tc>
@@ -3179,19 +3179,23 @@
     </w:p>
     <w:p>
       <w:r>
-        <w:t>• 當週累積自行車 18.76 km、跑步 12.05 km、游泳 0.00 km，整體時間執行率達 13.8%。</w:t>
+        <w:t>• 當週累積自行車 57.08 km、跑步 17.08 km、游泳 3.35 km，整體時間執行率達 33.9%。</w:t>
         <w:br/>
       </w:r>
       <w:r>
-        <w:t>• Build 1-3 第一建構期巔峰週展開 (Peak Build Phase)：本週為第一建構期負荷最高峰，全週排定總訓練時長達 14.9 小時。截至目前已累積跑步 12.05 km (1.41 小時)，整體時間執行率達 13.8%。</w:t>
+        <w:t>• Build 1-3 第一建構期巔峰週展開 (Peak Build Phase)：本週為第一建構期負荷最高峰，全週排定總訓練時長達 14.9 小時。截至目前已累積自行車 57.08 km (0.67 小時)、跑步 17.08 km (1.41 小時)，整體時間執行率達 33.9%。</w:t>
         <w:br/>
       </w:r>
       <w:r>
-        <w:t>• 週二 12.05km 跑步專項高水準間歇 (80.4 rTSS)：9/15 早晨順利完成 1 小時 24 分 33 秒 12.05 km 跑步專項課表 (原定 11.60km，距離達成率 103.9% 超額完成，TSS 達成率 97.6%)。均速 7:01/km (均速 8.55 km/h，最快 4:00/km)，均瓦 212W (3.20 W/kg，最大 400W，做功 1,077.9 kJ)，均心率 155 bpm (最高 191 bpm 深度刺激心肌收縮與攝氧能力)。多組 400m 間歇衝刺組均速飆出 3:45~3:55/km，衝刺步頻高達 180~188 spm (最高 214 spm)！平均觸地時間僅 249ms、垂直比 8.0% (&lt;9% 頂級標準)，展現極致跑姿落地剛性與動態經濟性，體感自覺給出 5/5 極佳滿分！</w:t>
+        <w:t>• 週二下午室內單車 Threshold 5X3 18.76km (36.0 TSS)：9/15 下午 15:22 順利完成 40 分 22 秒室內單車課表 (原定 40 分鐘，時間達成率 100.9% 精準達標)。距離 18.76 km、爬升 76m、NP 151W、均瓦 131W (1.98 W/kg，最大 197W，做功 319.4 kJ)、均心率 134 bpm (最高 157 bpm)、均踏頻 86 rpm (最大 95 rpm)、VI 1.15。核心 5 組 3 分鐘閾值間歇輸出分別為 181.6W、181.8W、181.7W、181.8W、181.8W，功率輸出極致穩定（誤差 &lt; 0.2W），踏頻穩固於 87~89 rpm，心率解耦率僅 3.84% (&lt;5% 頂級標準)，心血管耐受極佳且無疲勞漂移！今日晨跑加下午閾值單車單日合計斬獲 116.4 TSS、30.81 km！</w:t>
         <w:br/>
       </w:r>
       <w:r>
-        <w:t>• 明日週三 50m 長池甜甜泳課動態排酸：明日排定 80 分鐘 50m 長池「甜甜課表」，善用長池水壓與浮力深度代謝今日下肢跑步乳酸，持續鞏固 Sub-11 (1:53/100m) 流線型水感，可查閱儀表板 #swim 專區最新游泳技術文章。</w:t>
+        <w:t>• 週二晨間 12.05km 跑步專項高水準間歇 (80.4 rTSS)：9/15 早晨順利完成 1 小時 24 分 33 秒 12.05 km 跑步專項課表 (原定 11.60km，距離達成率 103.9% 超額完成，TSS 達成率 97.6%)。均速 7:01/km (均速 8.55 km/h，最快 4:00/km)，均瓦 212W (3.20 W/kg，最大 400W，做功 1,077.9 kJ)，均心率 155 bpm (最高 191 bpm 深度刺激心肌收縮與攝氧能力)。多組 400m 間歇衝刺組均速飆出 3:45~3:55/km，衝刺步頻高達 180~188 spm (最高 214 spm)！平均觸地時間僅 249ms、垂直比 8.0% (&lt;9% 頂級標準)，展現極致跑姿落地剛性與動態經濟性，體感自覺給出 5/5 極佳滿分！</w:t>
+        <w:br/>
+      </w:r>
+      <w:r>
+        <w:t>• 明日週三 50m 長池甜甜泳課動態排酸：明日排定 80 分鐘 50m 長池「甜甜課表」，善用長池水壓與浮力深度代謝今日下肢跑步與單車乳酸，持續鞏固 Sub-11 (1:53/100m) 流線型水感，可查閱儀表板 #swim 專區最新游泳技術文章。</w:t>
         <w:br/>
       </w:r>
     </w:p>

</xml_diff>

<commit_message>
Auto Daily 8:00 PM Dashboard Update [2026-09-18 20:59]
</commit_message>
<xml_diff>
--- a/docs/weekly/2026-W38_當週執行率回顧報告.docx
+++ b/docs/weekly/2026-W38_當週執行率回顧報告.docx
@@ -21,7 +21,7 @@
           <w:color w:val="555555"/>
           <w:sz w:val="20"/>
         </w:rPr>
-        <w:t>週期：2026/09/14–2026/09/20　｜　整體時間執行率：33.9%</w:t>
+        <w:t>週期：2026/09/14–2026/09/20　｜　整體時間執行率：41.2%</w:t>
       </w:r>
     </w:p>
     <w:p>
@@ -347,7 +347,7 @@
                 <w:color w:val="000000"/>
                 <w:sz w:val="19"/>
               </w:rPr>
-              <w:t>1.07 hr</w:t>
+              <w:t>2.15 hr</w:t>
             </w:r>
           </w:p>
         </w:tc>
@@ -374,7 +374,7 @@
                 <w:color w:val="000000"/>
                 <w:sz w:val="19"/>
               </w:rPr>
-              <w:t>27.8%</w:t>
+              <w:t>56.1%</w:t>
             </w:r>
           </w:p>
         </w:tc>
@@ -428,7 +428,7 @@
                 <w:color w:val="000000"/>
                 <w:sz w:val="19"/>
               </w:rPr>
-              <w:t>3.35 km</w:t>
+              <w:t>6.55 km</w:t>
             </w:r>
           </w:p>
         </w:tc>
@@ -455,7 +455,7 @@
                 <w:color w:val="000000"/>
                 <w:sz w:val="19"/>
               </w:rPr>
-              <w:t>95.7%</w:t>
+              <w:t>187.1%</w:t>
             </w:r>
           </w:p>
         </w:tc>
@@ -2461,7 +2461,7 @@
                 <w:color w:val="000000"/>
                 <w:sz w:val="19"/>
               </w:rPr>
-              <w:t>0分</w:t>
+              <w:t>65分 / 3.20km</w:t>
             </w:r>
           </w:p>
         </w:tc>
@@ -2488,7 +2488,7 @@
                 <w:color w:val="000000"/>
                 <w:sz w:val="19"/>
               </w:rPr>
-              <w:t>❌ 未執行/待排程</w:t>
+              <w:t>🟢 良好達標 (81%, A-)</w:t>
             </w:r>
           </w:p>
         </w:tc>
@@ -3179,11 +3179,11 @@
     </w:p>
     <w:p>
       <w:r>
-        <w:t>• 當週累積自行車 57.08 km、跑步 17.08 km、游泳 3.35 km，整體時間執行率達 33.9%。</w:t>
+        <w:t>• 當週累積自行車 57.08 km、跑步 17.08 km、游泳 6.55 km，整體時間執行率達 41.2%。</w:t>
         <w:br/>
       </w:r>
       <w:r>
-        <w:t>• Build 1-3 第一建構期巔峰週展開 (Peak Build Phase)：本週為第一建構期負荷最高峰，全週排定總訓練時長達 14.9 小時。截至目前已累積自行車 57.08 km (0.67 小時)、跑步 17.08 km (1.41 小時)，整體時間執行率達 33.9%。</w:t>
+        <w:t>• Build 1-3 第一建構期巔峰週展開 (Peak Build Phase)：本週為第一建構期負荷最高峰，全週排定總訓練時長達 14.9 小時。截至目前已累積自行車 57.08 km (0.67 小時)、跑步 17.08 km (1.41 小時)，整體時間執行率達 41.2%。</w:t>
         <w:br/>
       </w:r>
       <w:r>

</xml_diff>

<commit_message>
Auto Daily 8:00 PM Dashboard Update [2026-09-19 21:24]
</commit_message>
<xml_diff>
--- a/docs/weekly/2026-W38_當週執行率回顧報告.docx
+++ b/docs/weekly/2026-W38_當週執行率回顧報告.docx
@@ -21,7 +21,7 @@
           <w:color w:val="555555"/>
           <w:sz w:val="20"/>
         </w:rPr>
-        <w:t>週期：2026/09/14–2026/09/20　｜　整體時間執行率：41.2%</w:t>
+        <w:t>週期：2026/09/14–2026/09/20　｜　整體時間執行率：67.6%</w:t>
       </w:r>
     </w:p>
     <w:p>
@@ -565,7 +565,7 @@
                 <w:color w:val="000000"/>
                 <w:sz w:val="19"/>
               </w:rPr>
-              <w:t>2.10 hr</w:t>
+              <w:t>5.70 hr</w:t>
             </w:r>
           </w:p>
         </w:tc>
@@ -592,7 +592,7 @@
                 <w:color w:val="000000"/>
                 <w:sz w:val="19"/>
               </w:rPr>
-              <w:t>31.8%</w:t>
+              <w:t>86.4%</w:t>
             </w:r>
           </w:p>
         </w:tc>
@@ -646,7 +646,7 @@
                 <w:color w:val="000000"/>
                 <w:sz w:val="19"/>
               </w:rPr>
-              <w:t>57.08 km</w:t>
+              <w:t>146.87 km</w:t>
             </w:r>
           </w:p>
         </w:tc>
@@ -673,7 +673,7 @@
                 <w:color w:val="000000"/>
                 <w:sz w:val="19"/>
               </w:rPr>
-              <w:t>47.6%</w:t>
+              <w:t>122.4%</w:t>
             </w:r>
           </w:p>
         </w:tc>
@@ -756,7 +756,7 @@
                 <w:color w:val="000000"/>
                 <w:sz w:val="19"/>
               </w:rPr>
-              <w:t>4.50 hr</w:t>
+              <w:t>4.00 hr</w:t>
             </w:r>
           </w:p>
         </w:tc>
@@ -810,7 +810,7 @@
                 <w:color w:val="000000"/>
                 <w:sz w:val="19"/>
               </w:rPr>
-              <w:t>42.2%</w:t>
+              <w:t>47.5%</w:t>
             </w:r>
           </w:p>
         </w:tc>
@@ -2627,7 +2627,7 @@
                 <w:color w:val="000000"/>
                 <w:sz w:val="19"/>
               </w:rPr>
-              <w:t>0分</w:t>
+              <w:t>216分 / 89.79km</w:t>
             </w:r>
           </w:p>
         </w:tc>
@@ -2654,7 +2654,7 @@
                 <w:color w:val="000000"/>
                 <w:sz w:val="19"/>
               </w:rPr>
-              <w:t>❌ 未執行/待排程</w:t>
+              <w:t>🟢 良好達標 (80%, A-)</w:t>
             </w:r>
           </w:p>
         </w:tc>
@@ -2932,7 +2932,7 @@
                 <w:color w:val="000000"/>
                 <w:sz w:val="19"/>
               </w:rPr>
-              <w:t>120分 / 21.00km</w:t>
+              <w:t>90分 / 21.00km</w:t>
             </w:r>
           </w:p>
         </w:tc>
@@ -3179,11 +3179,11 @@
     </w:p>
     <w:p>
       <w:r>
-        <w:t>• 當週累積自行車 57.08 km、跑步 17.08 km、游泳 6.55 km，整體時間執行率達 41.2%。</w:t>
+        <w:t>• 當週累積自行車 146.87 km、跑步 17.08 km、游泳 6.55 km，整體時間執行率達 67.6%。</w:t>
         <w:br/>
       </w:r>
       <w:r>
-        <w:t>• Build 1-3 第一建構期巔峰週展開 (Peak Build Phase)：本週為第一建構期負荷最高峰，全週排定總訓練時長達 14.9 小時。截至目前已累積自行車 57.08 km (0.67 小時)、跑步 17.08 km (1.41 小時)，整體時間執行率達 41.2%。</w:t>
+        <w:t>• Build 1-3 第一建構期巔峰週展開 (Peak Build Phase)：本週為第一建構期負荷最高峰，全週排定總訓練時長達 14.9 小時。截至目前已累積自行車 146.87 km (0.67 小時)、跑步 17.08 km (1.41 小時)，整體時間執行率達 67.6%。</w:t>
         <w:br/>
       </w:r>
       <w:r>

</xml_diff>

<commit_message>
feat: establish TP detailed workout verification SOP and sync 2026-09-20 W38 workouts
</commit_message>
<xml_diff>
--- a/docs/weekly/2026-W38_當週執行率回顧報告.docx
+++ b/docs/weekly/2026-W38_當週執行率回顧報告.docx
@@ -21,7 +21,7 @@
           <w:color w:val="555555"/>
           <w:sz w:val="20"/>
         </w:rPr>
-        <w:t>週期：2026/09/14–2026/09/20　｜　整體時間執行率：67.6%</w:t>
+        <w:t>週期：2026/09/14–2026/09/20　｜　整體時間執行率：85.2%</w:t>
       </w:r>
     </w:p>
     <w:p>
@@ -347,7 +347,7 @@
                 <w:color w:val="000000"/>
                 <w:sz w:val="19"/>
               </w:rPr>
-              <w:t>2.15 hr</w:t>
+              <w:t>3.20 hr</w:t>
             </w:r>
           </w:p>
         </w:tc>
@@ -374,7 +374,7 @@
                 <w:color w:val="000000"/>
                 <w:sz w:val="19"/>
               </w:rPr>
-              <w:t>56.1%</w:t>
+              <w:t>83.5%</w:t>
             </w:r>
           </w:p>
         </w:tc>
@@ -428,7 +428,7 @@
                 <w:color w:val="000000"/>
                 <w:sz w:val="19"/>
               </w:rPr>
-              <w:t>6.55 km</w:t>
+              <w:t>9.85 km</w:t>
             </w:r>
           </w:p>
         </w:tc>
@@ -455,7 +455,7 @@
                 <w:color w:val="000000"/>
                 <w:sz w:val="19"/>
               </w:rPr>
-              <w:t>187.1%</w:t>
+              <w:t>281.4%</w:t>
             </w:r>
           </w:p>
         </w:tc>
@@ -783,7 +783,7 @@
                 <w:color w:val="000000"/>
                 <w:sz w:val="19"/>
               </w:rPr>
-              <w:t>1.90 hr</w:t>
+              <w:t>3.40 hr</w:t>
             </w:r>
           </w:p>
         </w:tc>
@@ -810,7 +810,7 @@
                 <w:color w:val="000000"/>
                 <w:sz w:val="19"/>
               </w:rPr>
-              <w:t>47.5%</w:t>
+              <w:t>85.0%</w:t>
             </w:r>
           </w:p>
         </w:tc>
@@ -864,7 +864,7 @@
                 <w:color w:val="000000"/>
                 <w:sz w:val="19"/>
               </w:rPr>
-              <w:t>17.08 km</w:t>
+              <w:t>32.85 km</w:t>
             </w:r>
           </w:p>
         </w:tc>
@@ -891,7 +891,7 @@
                 <w:color w:val="000000"/>
                 <w:sz w:val="19"/>
               </w:rPr>
-              <w:t>52.4%</w:t>
+              <w:t>100.8%</w:t>
             </w:r>
           </w:p>
         </w:tc>
@@ -2959,7 +2959,7 @@
                 <w:color w:val="000000"/>
                 <w:sz w:val="19"/>
               </w:rPr>
-              <w:t>0分</w:t>
+              <w:t>90分 / 15.77km</w:t>
             </w:r>
           </w:p>
         </w:tc>
@@ -2986,7 +2986,7 @@
                 <w:color w:val="000000"/>
                 <w:sz w:val="19"/>
               </w:rPr>
-              <w:t>❌ 未執行/待排程</w:t>
+              <w:t>✅ 精準達標 (100%, A+)</w:t>
             </w:r>
           </w:p>
         </w:tc>
@@ -3125,7 +3125,7 @@
                 <w:color w:val="000000"/>
                 <w:sz w:val="19"/>
               </w:rPr>
-              <w:t>0分</w:t>
+              <w:t>63分 / 3.30km</w:t>
             </w:r>
           </w:p>
         </w:tc>
@@ -3152,7 +3152,7 @@
                 <w:color w:val="000000"/>
                 <w:sz w:val="19"/>
               </w:rPr>
-              <w:t>❌ 未執行/待排程</w:t>
+              <w:t>🟢 良好達標 (90%, A-)</w:t>
             </w:r>
           </w:p>
         </w:tc>
@@ -3179,23 +3179,31 @@
     </w:p>
     <w:p>
       <w:r>
-        <w:t>• 當週累積自行車 146.87 km、跑步 17.08 km、游泳 6.55 km，整體時間執行率達 67.6%。</w:t>
+        <w:t>• 當週累積自行車 146.87 km、跑步 32.85 km、游泳 9.85 km，整體時間執行率達 85.2%。</w:t>
         <w:br/>
       </w:r>
       <w:r>
-        <w:t>• Build 1-3 第一建構期巔峰週展開 (Peak Build Phase)：本週為第一建構期負荷最高峰，全週排定總訓練時長達 14.9 小時。截至目前已累積自行車 146.87 km (0.67 小時)、跑步 17.08 km (1.41 小時)，整體時間執行率達 67.6%。</w:t>
+        <w:t>• Build 1-3 第一建構期巔峰週圓滿結算 (Peak Build Phase)：本週為第一建構期負荷最高峰，全週累積自行車 146.87 km、跑步 32.85 km、游泳 9.85 km，三項總時長達 12.3 小時 (~12.3 小時)，整體時間執行率達 85.2%。目前體能狀況指標 (PMC) 邁入高峰期：Fitness (CTL) 達 98 (即將破百！)、Fatigue (ATL) 128、Form (TSB) -22，展現極佳的超補償承受力與高質量耐力底層！</w:t>
         <w:br/>
       </w:r>
       <w:r>
-        <w:t>• 週二下午室內單車 Threshold 5X3 18.76km (36.0 TSS)：9/15 下午 15:22 順利完成 40 分 22 秒室內單車課表 (原定 40 分鐘，時間達成率 100.9% 精準達標)。距離 18.76 km、爬升 76m、NP 151W、均瓦 131W (1.98 W/kg，最大 197W，做功 319.4 kJ)、均心率 134 bpm (最高 157 bpm)、均踏頻 86 rpm (最大 95 rpm)、VI 1.15。核心 5 組 3 分鐘閾值間歇輸出分別為 181.6W、181.8W、181.7W、181.8W、181.8W，功率輸出極致穩定（誤差 &lt; 0.2W），踏頻穩固於 87~89 rpm，心率解耦率僅 3.84% (&lt;5% 頂級標準)，心血管耐受極佳且無疲勞漂移！今日晨跑加下午閾值單車單日合計斬獲 116.4 TSS、30.81 km！</w:t>
+        <w:t>• 週日清晨 15.8km 比賽配速跑 (81 rTSS) ＋ 50m長池 3,500m 比賽配速長游 (3.30km) 頂尖雙主課：9/20 早晨 5:41 順利完成 1 小時 30 分 01 秒 15.8 km 跑步磚菜單 (原定 90 分鐘，時間達成率 100.0% 精準達標，斬獲 81 rTSS)。均速 5:43/km (最快 5:25/km，精準直擊 Sub-11 全馬 5:41/km 目標配速線！)，均速 10.51 km/h，消耗 1,035 kcal，爬升 6m。完美執行 Brick 90min 漸進配速：15min easy -&gt; 30min 5:55-5:45/km -&gt; 30min 5:45-5:35/km -&gt; 15min 5:35-5:25/km。更打破 3 項近 90 天最佳紀錄 (Peak Performances x4)：5km 27:08 (05:26/km)、5mi 43:59 (05:28/km)、10km 55:17 (05:32/km)！體感自覺給出 4/5 良好微笑、RPE 3 Moderate (Conversational pace 說話配速，維持有氧巡航無早衰疲勞)；隨後接續 50m 長池 3,500m 比賽配速長游 (實游 3.30km, 63 分鐘, 時間達成率 90%)，水感流線型與長距離配速穩定發揮！</w:t>
         <w:br/>
       </w:r>
       <w:r>
-        <w:t>• 週二晨間 12.05km 跑步專項高水準間歇 (80.4 rTSS)：9/15 早晨順利完成 1 小時 24 分 33 秒 12.05 km 跑步專項課表 (原定 11.60km，距離達成率 103.9% 超額完成，TSS 達成率 97.6%)。均速 7:01/km (均速 8.55 km/h，最快 4:00/km)，均瓦 212W (3.20 W/kg，最大 400W，做功 1,077.9 kJ)，均心率 155 bpm (最高 191 bpm 深度刺激心肌收縮與攝氧能力)。多組 400m 間歇衝刺組均速飆出 3:45~3:55/km，衝刺步頻高達 180~188 spm (最高 214 spm)！平均觸地時間僅 249ms、垂直比 8.0% (&lt;9% 頂級標準)，展現極致跑姿落地剛性與動態經濟性，體感自覺給出 5/5 極佳滿分！</w:t>
+        <w:t>• 週六北海岸外騎大安～中角灣～大安 89.79km (216分)：9/19 完成 3 小時 36 分外騎長課表，嚴守 IF 0.75~0.8 有氧耐力區間與補水防熱紀律。</w:t>
         <w:br/>
       </w:r>
       <w:r>
-        <w:t>• 明日週三 50m 長池甜甜泳課動態排酸：明日排定 80 分鐘 50m 長池「甜甜課表」，善用長池水壓與浮力深度代謝今日下肢跑步與單車乳酸，持續鞏固 Sub-11 (1:53/100m) 流線型水感，可查閱儀表板 #swim 專區最新游泳技術文章。</w:t>
+        <w:t>• 週四單車 TEMPO 3x18' (38.32km) ＋ 轉換跑 EASY 30分 (5.03km)：9/17 順利吃下 86 分鐘單車節奏間歇與 30 分鐘轉換跑，肌肉轉換適應無縫切換。</w:t>
+        <w:br/>
+      </w:r>
+      <w:r>
+        <w:t>• 週三與週五 雙長池甜甜泳課 (合計 6.55km)：9/16 游泳 64 分 (3.35km)、9/18 游泳 65 分 (3.20km)，持續強化 50m 長池核心流線型與動態排酸。</w:t>
+        <w:br/>
+      </w:r>
+      <w:r>
+        <w:t>• 週二晨跑 12.05km 速度間歇 (80.4 rTSS) ＋ 下午室內單車 Threshold 5X3 (18.76km, 36.0 TSS)：9/15 早晨 400m 間歇均速 3:45~3:55/km、步頻 180~188 spm；下午室內單車 5 組 3 分鐘閾值間歇均瓦 181.8W 極致穩定，單日合斬 116.4 TSS、30.81 km！</w:t>
         <w:br/>
       </w:r>
     </w:p>

</xml_diff>